<commit_message>
Updated the User Manual to account for exponent token
</commit_message>
<xml_diff>
--- a/doc/DOCX originals/Calculatorz_Users_Manual.docx
+++ b/doc/DOCX originals/Calculatorz_Users_Manual.docx
@@ -1431,12 +1431,6 @@
         <w:gridCol w:w="6240"/>
       </w:tblGrid>
       <w:tr>
-        <w:tblPrEx>
-          <w:tblCellMar>
-            <w:top w:w="0" w:type="dxa"/>
-            <w:bottom w:w="0" w:type="dxa"/>
-          </w:tblCellMar>
-        </w:tblPrEx>
         <w:tc>
           <w:tcPr>
             <w:tcW w:w="3120" w:type="dxa"/>
@@ -1495,12 +1489,6 @@
         </w:tc>
       </w:tr>
       <w:tr>
-        <w:tblPrEx>
-          <w:tblCellMar>
-            <w:top w:w="0" w:type="dxa"/>
-            <w:bottom w:w="0" w:type="dxa"/>
-          </w:tblCellMar>
-        </w:tblPrEx>
         <w:tc>
           <w:tcPr>
             <w:tcW w:w="3120" w:type="dxa"/>
@@ -1554,12 +1542,6 @@
         </w:tc>
       </w:tr>
       <w:tr>
-        <w:tblPrEx>
-          <w:tblCellMar>
-            <w:top w:w="0" w:type="dxa"/>
-            <w:bottom w:w="0" w:type="dxa"/>
-          </w:tblCellMar>
-        </w:tblPrEx>
         <w:tc>
           <w:tcPr>
             <w:tcW w:w="3120" w:type="dxa"/>
@@ -1612,12 +1594,6 @@
         </w:tc>
       </w:tr>
       <w:tr>
-        <w:tblPrEx>
-          <w:tblCellMar>
-            <w:top w:w="0" w:type="dxa"/>
-            <w:bottom w:w="0" w:type="dxa"/>
-          </w:tblCellMar>
-        </w:tblPrEx>
         <w:tc>
           <w:tcPr>
             <w:tcW w:w="3120" w:type="dxa"/>
@@ -1670,12 +1646,6 @@
         </w:tc>
       </w:tr>
       <w:tr>
-        <w:tblPrEx>
-          <w:tblCellMar>
-            <w:top w:w="0" w:type="dxa"/>
-            <w:bottom w:w="0" w:type="dxa"/>
-          </w:tblCellMar>
-        </w:tblPrEx>
         <w:tc>
           <w:tcPr>
             <w:tcW w:w="3120" w:type="dxa"/>
@@ -1722,24 +1692,12 @@
               <w:rPr>
                 <w:rFonts w:eastAsia="Arial"/>
               </w:rPr>
-              <w:t>Subtraction (</w:t>
-            </w:r>
-            <w:r>
-              <w:rPr>
-                <w:rFonts w:eastAsia="Arial"/>
-              </w:rPr>
-              <w:t>or unary minus when at the start of an expression or after another operator / open parenthesis)</w:t>
+              <w:t>Subtraction (or unary minus when at the start of an expression or after another operator / open parenthesis)</w:t>
             </w:r>
           </w:p>
         </w:tc>
       </w:tr>
       <w:tr>
-        <w:tblPrEx>
-          <w:tblCellMar>
-            <w:top w:w="0" w:type="dxa"/>
-            <w:bottom w:w="0" w:type="dxa"/>
-          </w:tblCellMar>
-        </w:tblPrEx>
         <w:tc>
           <w:tcPr>
             <w:tcW w:w="3120" w:type="dxa"/>
@@ -1758,10 +1716,7 @@
           </w:tcPr>
           <w:p>
             <w:r>
-              <w:rPr>
-                <w:rFonts w:eastAsia="Arial"/>
-              </w:rPr>
-              <w:t>*</w:t>
+              <w:t>x</w:t>
             </w:r>
           </w:p>
         </w:tc>
@@ -1792,12 +1747,6 @@
         </w:tc>
       </w:tr>
       <w:tr>
-        <w:tblPrEx>
-          <w:tblCellMar>
-            <w:top w:w="0" w:type="dxa"/>
-            <w:bottom w:w="0" w:type="dxa"/>
-          </w:tblCellMar>
-        </w:tblPrEx>
         <w:tc>
           <w:tcPr>
             <w:tcW w:w="3120" w:type="dxa"/>
@@ -1815,11 +1764,16 @@
             </w:tcMar>
           </w:tcPr>
           <w:p>
-            <w:r>
-              <w:rPr>
-                <w:rFonts w:eastAsia="Arial"/>
-              </w:rPr>
-              <w:t>/</w:t>
+            <w:pPr>
+              <w:rPr>
+                <w:color w:val="000000"/>
+              </w:rPr>
+            </w:pPr>
+            <w:r>
+              <w:rPr>
+                <w:color w:val="000000"/>
+              </w:rPr>
+              <w:t>÷</w:t>
             </w:r>
           </w:p>
         </w:tc>
@@ -1850,12 +1804,6 @@
         </w:tc>
       </w:tr>
       <w:tr>
-        <w:tblPrEx>
-          <w:tblCellMar>
-            <w:top w:w="0" w:type="dxa"/>
-            <w:bottom w:w="0" w:type="dxa"/>
-          </w:tblCellMar>
-        </w:tblPrEx>
         <w:tc>
           <w:tcPr>
             <w:tcW w:w="3120" w:type="dxa"/>
@@ -1873,11 +1821,16 @@
             </w:tcMar>
           </w:tcPr>
           <w:p>
-            <w:r>
-              <w:rPr>
-                <w:rFonts w:eastAsia="Arial"/>
-              </w:rPr>
-              <w:t>(</w:t>
+            <w:pPr>
+              <w:rPr>
+                <w:color w:val="000000"/>
+              </w:rPr>
+            </w:pPr>
+            <w:r>
+              <w:rPr>
+                <w:color w:val="000000"/>
+              </w:rPr>
+              <w:t>^</w:t>
             </w:r>
           </w:p>
         </w:tc>
@@ -1898,34 +1851,85 @@
             </w:tcMar>
           </w:tcPr>
           <w:p>
-            <w:r>
-              <w:rPr>
-                <w:rFonts w:eastAsia="Arial"/>
-              </w:rPr>
-              <w:t>Open parenthesis</w:t>
-            </w:r>
-            <w:r>
-              <w:rPr>
-                <w:rFonts w:eastAsia="Arial"/>
-              </w:rPr>
-              <w:t>:</w:t>
-            </w:r>
-            <w:r>
-              <w:rPr>
-                <w:rFonts w:eastAsia="Arial"/>
-              </w:rPr>
-              <w:t xml:space="preserve"> increases precedence of enclosed sub-expression</w:t>
+            <w:pPr>
+              <w:rPr>
+                <w:rFonts w:eastAsia="Arial"/>
+              </w:rPr>
+            </w:pPr>
+            <w:r>
+              <w:rPr>
+                <w:rFonts w:eastAsia="Arial"/>
+              </w:rPr>
+              <w:t>Exponential</w:t>
             </w:r>
           </w:p>
         </w:tc>
       </w:tr>
       <w:tr>
-        <w:tblPrEx>
-          <w:tblCellMar>
-            <w:top w:w="0" w:type="dxa"/>
-            <w:bottom w:w="0" w:type="dxa"/>
-          </w:tblCellMar>
-        </w:tblPrEx>
+        <w:tc>
+          <w:tcPr>
+            <w:tcW w:w="3120" w:type="dxa"/>
+            <w:tcBorders>
+              <w:top w:val="single" w:sz="1" w:space="0" w:color="CCCCCC"/>
+              <w:left w:val="single" w:sz="1" w:space="0" w:color="CCCCCC"/>
+              <w:bottom w:val="single" w:sz="1" w:space="0" w:color="CCCCCC"/>
+              <w:right w:val="single" w:sz="1" w:space="0" w:color="CCCCCC"/>
+            </w:tcBorders>
+            <w:tcMar>
+              <w:top w:w="80" w:type="dxa"/>
+              <w:left w:w="120" w:type="dxa"/>
+              <w:bottom w:w="80" w:type="dxa"/>
+              <w:right w:w="120" w:type="dxa"/>
+            </w:tcMar>
+          </w:tcPr>
+          <w:p>
+            <w:r>
+              <w:rPr>
+                <w:rFonts w:eastAsia="Arial"/>
+              </w:rPr>
+              <w:t>(</w:t>
+            </w:r>
+          </w:p>
+        </w:tc>
+        <w:tc>
+          <w:tcPr>
+            <w:tcW w:w="6240" w:type="dxa"/>
+            <w:tcBorders>
+              <w:top w:val="single" w:sz="1" w:space="0" w:color="CCCCCC"/>
+              <w:left w:val="single" w:sz="1" w:space="0" w:color="CCCCCC"/>
+              <w:bottom w:val="single" w:sz="1" w:space="0" w:color="CCCCCC"/>
+              <w:right w:val="single" w:sz="1" w:space="0" w:color="CCCCCC"/>
+            </w:tcBorders>
+            <w:tcMar>
+              <w:top w:w="80" w:type="dxa"/>
+              <w:left w:w="120" w:type="dxa"/>
+              <w:bottom w:w="80" w:type="dxa"/>
+              <w:right w:w="120" w:type="dxa"/>
+            </w:tcMar>
+          </w:tcPr>
+          <w:p>
+            <w:r>
+              <w:rPr>
+                <w:rFonts w:eastAsia="Arial"/>
+              </w:rPr>
+              <w:t>Open parenthesis</w:t>
+            </w:r>
+            <w:r>
+              <w:rPr>
+                <w:rFonts w:eastAsia="Arial"/>
+              </w:rPr>
+              <w:t>:</w:t>
+            </w:r>
+            <w:r>
+              <w:rPr>
+                <w:rFonts w:eastAsia="Arial"/>
+              </w:rPr>
+              <w:t xml:space="preserve"> increases precedence of enclosed sub-expression</w:t>
+            </w:r>
+          </w:p>
+        </w:tc>
+      </w:tr>
+      <w:tr>
         <w:tc>
           <w:tcPr>
             <w:tcW w:w="3120" w:type="dxa"/>
@@ -2434,12 +2438,6 @@
         <w:gridCol w:w="4680"/>
       </w:tblGrid>
       <w:tr>
-        <w:tblPrEx>
-          <w:tblCellMar>
-            <w:top w:w="0" w:type="dxa"/>
-            <w:bottom w:w="0" w:type="dxa"/>
-          </w:tblCellMar>
-        </w:tblPrEx>
         <w:tc>
           <w:tcPr>
             <w:tcW w:w="2808" w:type="dxa"/>
@@ -2526,12 +2524,6 @@
         </w:tc>
       </w:tr>
       <w:tr>
-        <w:tblPrEx>
-          <w:tblCellMar>
-            <w:top w:w="0" w:type="dxa"/>
-            <w:bottom w:w="0" w:type="dxa"/>
-          </w:tblCellMar>
-        </w:tblPrEx>
         <w:tc>
           <w:tcPr>
             <w:tcW w:w="2808" w:type="dxa"/>
@@ -2609,12 +2601,6 @@
         </w:tc>
       </w:tr>
       <w:tr>
-        <w:tblPrEx>
-          <w:tblCellMar>
-            <w:top w:w="0" w:type="dxa"/>
-            <w:bottom w:w="0" w:type="dxa"/>
-          </w:tblCellMar>
-        </w:tblPrEx>
         <w:tc>
           <w:tcPr>
             <w:tcW w:w="2808" w:type="dxa"/>
@@ -2636,6 +2622,7 @@
               <w:rPr>
                 <w:rFonts w:eastAsia="Arial"/>
               </w:rPr>
+              <w:lastRenderedPageBreak/>
               <w:t>(2 + 3) * 4</w:t>
             </w:r>
           </w:p>
@@ -2692,12 +2679,6 @@
         </w:tc>
       </w:tr>
       <w:tr>
-        <w:tblPrEx>
-          <w:tblCellMar>
-            <w:top w:w="0" w:type="dxa"/>
-            <w:bottom w:w="0" w:type="dxa"/>
-          </w:tblCellMar>
-        </w:tblPrEx>
         <w:tc>
           <w:tcPr>
             <w:tcW w:w="2808" w:type="dxa"/>
@@ -2719,7 +2700,6 @@
               <w:rPr>
                 <w:rFonts w:eastAsia="Arial"/>
               </w:rPr>
-              <w:lastRenderedPageBreak/>
               <w:t>10 / 2 - 1</w:t>
             </w:r>
           </w:p>
@@ -2776,12 +2756,6 @@
         </w:tc>
       </w:tr>
       <w:tr>
-        <w:tblPrEx>
-          <w:tblCellMar>
-            <w:top w:w="0" w:type="dxa"/>
-            <w:bottom w:w="0" w:type="dxa"/>
-          </w:tblCellMar>
-        </w:tblPrEx>
         <w:tc>
           <w:tcPr>
             <w:tcW w:w="2808" w:type="dxa"/>
@@ -2799,6 +2773,11 @@
             </w:tcMar>
           </w:tcPr>
           <w:p>
+            <w:pPr>
+              <w:rPr>
+                <w:rFonts w:eastAsia="Arial"/>
+              </w:rPr>
+            </w:pPr>
             <w:r>
               <w:rPr>
                 <w:rFonts w:eastAsia="Arial"/>
@@ -2854,6 +2833,98 @@
                 <w:rFonts w:eastAsia="Arial"/>
               </w:rPr>
               <w:t>Inner 2 * 2 = 4 first, then 8 / 4</w:t>
+            </w:r>
+          </w:p>
+        </w:tc>
+      </w:tr>
+      <w:tr>
+        <w:tc>
+          <w:tcPr>
+            <w:tcW w:w="2808" w:type="dxa"/>
+            <w:tcBorders>
+              <w:top w:val="single" w:sz="1" w:space="0" w:color="CCCCCC"/>
+              <w:left w:val="single" w:sz="1" w:space="0" w:color="CCCCCC"/>
+              <w:bottom w:val="single" w:sz="1" w:space="0" w:color="CCCCCC"/>
+              <w:right w:val="single" w:sz="1" w:space="0" w:color="CCCCCC"/>
+            </w:tcBorders>
+            <w:tcMar>
+              <w:top w:w="80" w:type="dxa"/>
+              <w:left w:w="120" w:type="dxa"/>
+              <w:bottom w:w="80" w:type="dxa"/>
+              <w:right w:w="120" w:type="dxa"/>
+            </w:tcMar>
+          </w:tcPr>
+          <w:p>
+            <w:pPr>
+              <w:rPr>
+                <w:rFonts w:eastAsia="Arial"/>
+              </w:rPr>
+            </w:pPr>
+            <w:r>
+              <w:rPr>
+                <w:rFonts w:eastAsia="Arial"/>
+              </w:rPr>
+              <w:t>(4^2) + 1</w:t>
+            </w:r>
+          </w:p>
+        </w:tc>
+        <w:tc>
+          <w:tcPr>
+            <w:tcW w:w="1872" w:type="dxa"/>
+            <w:tcBorders>
+              <w:top w:val="single" w:sz="1" w:space="0" w:color="CCCCCC"/>
+              <w:left w:val="single" w:sz="1" w:space="0" w:color="CCCCCC"/>
+              <w:bottom w:val="single" w:sz="1" w:space="0" w:color="CCCCCC"/>
+              <w:right w:val="single" w:sz="1" w:space="0" w:color="CCCCCC"/>
+            </w:tcBorders>
+            <w:tcMar>
+              <w:top w:w="80" w:type="dxa"/>
+              <w:left w:w="120" w:type="dxa"/>
+              <w:bottom w:w="80" w:type="dxa"/>
+              <w:right w:w="120" w:type="dxa"/>
+            </w:tcMar>
+          </w:tcPr>
+          <w:p>
+            <w:pPr>
+              <w:rPr>
+                <w:rFonts w:eastAsia="Arial"/>
+              </w:rPr>
+            </w:pPr>
+            <w:r>
+              <w:rPr>
+                <w:rFonts w:eastAsia="Arial"/>
+              </w:rPr>
+              <w:t>17</w:t>
+            </w:r>
+          </w:p>
+        </w:tc>
+        <w:tc>
+          <w:tcPr>
+            <w:tcW w:w="4680" w:type="dxa"/>
+            <w:tcBorders>
+              <w:top w:val="single" w:sz="1" w:space="0" w:color="CCCCCC"/>
+              <w:left w:val="single" w:sz="1" w:space="0" w:color="CCCCCC"/>
+              <w:bottom w:val="single" w:sz="1" w:space="0" w:color="CCCCCC"/>
+              <w:right w:val="single" w:sz="1" w:space="0" w:color="CCCCCC"/>
+            </w:tcBorders>
+            <w:tcMar>
+              <w:top w:w="80" w:type="dxa"/>
+              <w:left w:w="120" w:type="dxa"/>
+              <w:bottom w:w="80" w:type="dxa"/>
+              <w:right w:w="120" w:type="dxa"/>
+            </w:tcMar>
+          </w:tcPr>
+          <w:p>
+            <w:pPr>
+              <w:rPr>
+                <w:rFonts w:eastAsia="Arial"/>
+              </w:rPr>
+            </w:pPr>
+            <w:r>
+              <w:rPr>
+                <w:rFonts w:eastAsia="Arial"/>
+              </w:rPr>
+              <w:t>Inner 4 squared first, then 16 + 1</w:t>
             </w:r>
           </w:p>
         </w:tc>
@@ -3030,12 +3101,6 @@
         <w:gridCol w:w="6240"/>
       </w:tblGrid>
       <w:tr>
-        <w:tblPrEx>
-          <w:tblCellMar>
-            <w:top w:w="0" w:type="dxa"/>
-            <w:bottom w:w="0" w:type="dxa"/>
-          </w:tblCellMar>
-        </w:tblPrEx>
         <w:tc>
           <w:tcPr>
             <w:tcW w:w="3120" w:type="dxa"/>
@@ -3094,12 +3159,6 @@
         </w:tc>
       </w:tr>
       <w:tr>
-        <w:tblPrEx>
-          <w:tblCellMar>
-            <w:top w:w="0" w:type="dxa"/>
-            <w:bottom w:w="0" w:type="dxa"/>
-          </w:tblCellMar>
-        </w:tblPrEx>
         <w:tc>
           <w:tcPr>
             <w:tcW w:w="3120" w:type="dxa"/>
@@ -3152,12 +3211,6 @@
         </w:tc>
       </w:tr>
       <w:tr>
-        <w:tblPrEx>
-          <w:tblCellMar>
-            <w:top w:w="0" w:type="dxa"/>
-            <w:bottom w:w="0" w:type="dxa"/>
-          </w:tblCellMar>
-        </w:tblPrEx>
         <w:tc>
           <w:tcPr>
             <w:tcW w:w="3120" w:type="dxa"/>
@@ -3295,12 +3348,6 @@
         <w:gridCol w:w="3760"/>
       </w:tblGrid>
       <w:tr>
-        <w:tblPrEx>
-          <w:tblCellMar>
-            <w:top w:w="0" w:type="dxa"/>
-            <w:bottom w:w="0" w:type="dxa"/>
-          </w:tblCellMar>
-        </w:tblPrEx>
         <w:tc>
           <w:tcPr>
             <w:tcW w:w="2200" w:type="dxa"/>
@@ -3387,12 +3434,6 @@
         </w:tc>
       </w:tr>
       <w:tr>
-        <w:tblPrEx>
-          <w:tblCellMar>
-            <w:top w:w="0" w:type="dxa"/>
-            <w:bottom w:w="0" w:type="dxa"/>
-          </w:tblCellMar>
-        </w:tblPrEx>
         <w:tc>
           <w:tcPr>
             <w:tcW w:w="2200" w:type="dxa"/>
@@ -3470,12 +3511,6 @@
         </w:tc>
       </w:tr>
       <w:tr>
-        <w:tblPrEx>
-          <w:tblCellMar>
-            <w:top w:w="0" w:type="dxa"/>
-            <w:bottom w:w="0" w:type="dxa"/>
-          </w:tblCellMar>
-        </w:tblPrEx>
         <w:tc>
           <w:tcPr>
             <w:tcW w:w="2200" w:type="dxa"/>
@@ -3565,12 +3600,6 @@
         </w:tc>
       </w:tr>
       <w:tr>
-        <w:tblPrEx>
-          <w:tblCellMar>
-            <w:top w:w="0" w:type="dxa"/>
-            <w:bottom w:w="0" w:type="dxa"/>
-          </w:tblCellMar>
-        </w:tblPrEx>
         <w:tc>
           <w:tcPr>
             <w:tcW w:w="2200" w:type="dxa"/>
@@ -3648,12 +3677,6 @@
         </w:tc>
       </w:tr>
       <w:tr>
-        <w:tblPrEx>
-          <w:tblCellMar>
-            <w:top w:w="0" w:type="dxa"/>
-            <w:bottom w:w="0" w:type="dxa"/>
-          </w:tblCellMar>
-        </w:tblPrEx>
         <w:tc>
           <w:tcPr>
             <w:tcW w:w="2200" w:type="dxa"/>
@@ -3700,7 +3723,14 @@
               <w:rPr>
                 <w:rFonts w:eastAsia="Arial"/>
               </w:rPr>
-              <w:t>The expression contains a character that is not a digit, operator, decimal point, or parenthesis (e.g. 3 + x).</w:t>
+              <w:t xml:space="preserve">The expression contains a character </w:t>
+            </w:r>
+            <w:r>
+              <w:rPr>
+                <w:rFonts w:eastAsia="Arial"/>
+              </w:rPr>
+              <w:lastRenderedPageBreak/>
+              <w:t>that is not a digit, operator, decimal point, or parenthesis (e.g. 3 + x).</w:t>
             </w:r>
           </w:p>
         </w:tc>
@@ -3725,18 +3755,20 @@
               <w:rPr>
                 <w:rFonts w:eastAsia="Arial"/>
               </w:rPr>
-              <w:t>Remove or replace the unsupported character.</w:t>
+              <w:lastRenderedPageBreak/>
+              <w:t xml:space="preserve">Remove or replace the unsupported </w:t>
+            </w:r>
+            <w:r>
+              <w:rPr>
+                <w:rFonts w:eastAsia="Arial"/>
+              </w:rPr>
+              <w:lastRenderedPageBreak/>
+              <w:t>character.</w:t>
             </w:r>
           </w:p>
         </w:tc>
       </w:tr>
       <w:tr>
-        <w:tblPrEx>
-          <w:tblCellMar>
-            <w:top w:w="0" w:type="dxa"/>
-            <w:bottom w:w="0" w:type="dxa"/>
-          </w:tblCellMar>
-        </w:tblPrEx>
         <w:tc>
           <w:tcPr>
             <w:tcW w:w="2200" w:type="dxa"/>
@@ -3758,6 +3790,7 @@
               <w:rPr>
                 <w:rFonts w:eastAsia="Arial"/>
               </w:rPr>
+              <w:lastRenderedPageBreak/>
               <w:t>Invalid negative number</w:t>
             </w:r>
           </w:p>
@@ -3783,14 +3816,7 @@
               <w:rPr>
                 <w:rFonts w:eastAsia="Arial"/>
               </w:rPr>
-              <w:t xml:space="preserve">A minus sign used as unary negation is </w:t>
-            </w:r>
-            <w:r>
-              <w:rPr>
-                <w:rFonts w:eastAsia="Arial"/>
-              </w:rPr>
-              <w:lastRenderedPageBreak/>
-              <w:t>not followed by a digit or decimal point (e.g. a trailing - at end of input).</w:t>
+              <w:t>A minus sign used as unary negation is not followed by a digit or decimal point (e.g. a trailing - at end of input).</w:t>
             </w:r>
           </w:p>
         </w:tc>
@@ -3815,26 +3841,12 @@
               <w:rPr>
                 <w:rFonts w:eastAsia="Arial"/>
               </w:rPr>
-              <w:lastRenderedPageBreak/>
-              <w:t xml:space="preserve">Ensure a digit or decimal point </w:t>
-            </w:r>
-            <w:r>
-              <w:rPr>
-                <w:rFonts w:eastAsia="Arial"/>
-              </w:rPr>
-              <w:lastRenderedPageBreak/>
-              <w:t>immediately follows the negation sign.</w:t>
+              <w:t>Ensure a digit or decimal point immediately follows the negation sign.</w:t>
             </w:r>
           </w:p>
         </w:tc>
       </w:tr>
       <w:tr>
-        <w:tblPrEx>
-          <w:tblCellMar>
-            <w:top w:w="0" w:type="dxa"/>
-            <w:bottom w:w="0" w:type="dxa"/>
-          </w:tblCellMar>
-        </w:tblPrEx>
         <w:tc>
           <w:tcPr>
             <w:tcW w:w="2200" w:type="dxa"/>
@@ -3856,7 +3868,6 @@
               <w:rPr>
                 <w:rFonts w:eastAsia="Arial"/>
               </w:rPr>
-              <w:lastRenderedPageBreak/>
               <w:t>Invalid number format</w:t>
             </w:r>
           </w:p>
@@ -3955,12 +3966,6 @@
         <w:gridCol w:w="4368"/>
       </w:tblGrid>
       <w:tr>
-        <w:tblPrEx>
-          <w:tblCellMar>
-            <w:top w:w="0" w:type="dxa"/>
-            <w:bottom w:w="0" w:type="dxa"/>
-          </w:tblCellMar>
-        </w:tblPrEx>
         <w:tc>
           <w:tcPr>
             <w:tcW w:w="3120" w:type="dxa"/>
@@ -4047,12 +4052,6 @@
         </w:tc>
       </w:tr>
       <w:tr>
-        <w:tblPrEx>
-          <w:tblCellMar>
-            <w:top w:w="0" w:type="dxa"/>
-            <w:bottom w:w="0" w:type="dxa"/>
-          </w:tblCellMar>
-        </w:tblPrEx>
         <w:tc>
           <w:tcPr>
             <w:tcW w:w="3120" w:type="dxa"/>
@@ -4130,12 +4129,6 @@
         </w:tc>
       </w:tr>
       <w:tr>
-        <w:tblPrEx>
-          <w:tblCellMar>
-            <w:top w:w="0" w:type="dxa"/>
-            <w:bottom w:w="0" w:type="dxa"/>
-          </w:tblCellMar>
-        </w:tblPrEx>
         <w:tc>
           <w:tcPr>
             <w:tcW w:w="3120" w:type="dxa"/>
@@ -4213,12 +4206,6 @@
         </w:tc>
       </w:tr>
       <w:tr>
-        <w:tblPrEx>
-          <w:tblCellMar>
-            <w:top w:w="0" w:type="dxa"/>
-            <w:bottom w:w="0" w:type="dxa"/>
-          </w:tblCellMar>
-        </w:tblPrEx>
         <w:tc>
           <w:tcPr>
             <w:tcW w:w="3120" w:type="dxa"/>
@@ -4296,12 +4283,6 @@
         </w:tc>
       </w:tr>
       <w:tr>
-        <w:tblPrEx>
-          <w:tblCellMar>
-            <w:top w:w="0" w:type="dxa"/>
-            <w:bottom w:w="0" w:type="dxa"/>
-          </w:tblCellMar>
-        </w:tblPrEx>
         <w:tc>
           <w:tcPr>
             <w:tcW w:w="3120" w:type="dxa"/>
@@ -4379,12 +4360,6 @@
         </w:tc>
       </w:tr>
       <w:tr>
-        <w:tblPrEx>
-          <w:tblCellMar>
-            <w:top w:w="0" w:type="dxa"/>
-            <w:bottom w:w="0" w:type="dxa"/>
-          </w:tblCellMar>
-        </w:tblPrEx>
         <w:tc>
           <w:tcPr>
             <w:tcW w:w="3120" w:type="dxa"/>
@@ -4470,12 +4445,6 @@
         </w:tc>
       </w:tr>
       <w:tr>
-        <w:tblPrEx>
-          <w:tblCellMar>
-            <w:top w:w="0" w:type="dxa"/>
-            <w:bottom w:w="0" w:type="dxa"/>
-          </w:tblCellMar>
-        </w:tblPrEx>
         <w:tc>
           <w:tcPr>
             <w:tcW w:w="3120" w:type="dxa"/>
@@ -4553,12 +4522,6 @@
         </w:tc>
       </w:tr>
       <w:tr>
-        <w:tblPrEx>
-          <w:tblCellMar>
-            <w:top w:w="0" w:type="dxa"/>
-            <w:bottom w:w="0" w:type="dxa"/>
-          </w:tblCellMar>
-        </w:tblPrEx>
         <w:tc>
           <w:tcPr>
             <w:tcW w:w="3120" w:type="dxa"/>
@@ -4636,12 +4599,6 @@
         </w:tc>
       </w:tr>
       <w:tr>
-        <w:tblPrEx>
-          <w:tblCellMar>
-            <w:top w:w="0" w:type="dxa"/>
-            <w:bottom w:w="0" w:type="dxa"/>
-          </w:tblCellMar>
-        </w:tblPrEx>
         <w:tc>
           <w:tcPr>
             <w:tcW w:w="3120" w:type="dxa"/>
@@ -4719,12 +4676,6 @@
         </w:tc>
       </w:tr>
       <w:tr>
-        <w:tblPrEx>
-          <w:tblCellMar>
-            <w:top w:w="0" w:type="dxa"/>
-            <w:bottom w:w="0" w:type="dxa"/>
-          </w:tblCellMar>
-        </w:tblPrEx>
         <w:tc>
           <w:tcPr>
             <w:tcW w:w="3120" w:type="dxa"/>
@@ -4816,12 +4767,6 @@
         </w:tc>
       </w:tr>
       <w:tr>
-        <w:tblPrEx>
-          <w:tblCellMar>
-            <w:top w:w="0" w:type="dxa"/>
-            <w:bottom w:w="0" w:type="dxa"/>
-          </w:tblCellMar>
-        </w:tblPrEx>
         <w:tc>
           <w:tcPr>
             <w:tcW w:w="3120" w:type="dxa"/>
@@ -4932,12 +4877,6 @@
         <w:gridCol w:w="6552"/>
       </w:tblGrid>
       <w:tr>
-        <w:tblPrEx>
-          <w:tblCellMar>
-            <w:top w:w="0" w:type="dxa"/>
-            <w:bottom w:w="0" w:type="dxa"/>
-          </w:tblCellMar>
-        </w:tblPrEx>
         <w:tc>
           <w:tcPr>
             <w:tcW w:w="2808" w:type="dxa"/>
@@ -4996,12 +4935,6 @@
         </w:tc>
       </w:tr>
       <w:tr>
-        <w:tblPrEx>
-          <w:tblCellMar>
-            <w:top w:w="0" w:type="dxa"/>
-            <w:bottom w:w="0" w:type="dxa"/>
-          </w:tblCellMar>
-        </w:tblPrEx>
         <w:tc>
           <w:tcPr>
             <w:tcW w:w="2808" w:type="dxa"/>
@@ -5054,12 +4987,6 @@
         </w:tc>
       </w:tr>
       <w:tr>
-        <w:tblPrEx>
-          <w:tblCellMar>
-            <w:top w:w="0" w:type="dxa"/>
-            <w:bottom w:w="0" w:type="dxa"/>
-          </w:tblCellMar>
-        </w:tblPrEx>
         <w:tc>
           <w:tcPr>
             <w:tcW w:w="2808" w:type="dxa"/>
@@ -5112,12 +5039,6 @@
         </w:tc>
       </w:tr>
       <w:tr>
-        <w:tblPrEx>
-          <w:tblCellMar>
-            <w:top w:w="0" w:type="dxa"/>
-            <w:bottom w:w="0" w:type="dxa"/>
-          </w:tblCellMar>
-        </w:tblPrEx>
         <w:tc>
           <w:tcPr>
             <w:tcW w:w="2808" w:type="dxa"/>
@@ -5182,12 +5103,6 @@
         </w:tc>
       </w:tr>
       <w:tr>
-        <w:tblPrEx>
-          <w:tblCellMar>
-            <w:top w:w="0" w:type="dxa"/>
-            <w:bottom w:w="0" w:type="dxa"/>
-          </w:tblCellMar>
-        </w:tblPrEx>
         <w:tc>
           <w:tcPr>
             <w:tcW w:w="2808" w:type="dxa"/>
@@ -5240,12 +5155,6 @@
         </w:tc>
       </w:tr>
       <w:tr>
-        <w:tblPrEx>
-          <w:tblCellMar>
-            <w:top w:w="0" w:type="dxa"/>
-            <w:bottom w:w="0" w:type="dxa"/>
-          </w:tblCellMar>
-        </w:tblPrEx>
         <w:tc>
           <w:tcPr>
             <w:tcW w:w="2808" w:type="dxa"/>
@@ -5304,12 +5213,6 @@
         </w:tc>
       </w:tr>
       <w:tr>
-        <w:tblPrEx>
-          <w:tblCellMar>
-            <w:top w:w="0" w:type="dxa"/>
-            <w:bottom w:w="0" w:type="dxa"/>
-          </w:tblCellMar>
-        </w:tblPrEx>
         <w:tc>
           <w:tcPr>
             <w:tcW w:w="2808" w:type="dxa"/>
@@ -5362,12 +5265,6 @@
         </w:tc>
       </w:tr>
       <w:tr>
-        <w:tblPrEx>
-          <w:tblCellMar>
-            <w:top w:w="0" w:type="dxa"/>
-            <w:bottom w:w="0" w:type="dxa"/>
-          </w:tblCellMar>
-        </w:tblPrEx>
         <w:tc>
           <w:tcPr>
             <w:tcW w:w="2808" w:type="dxa"/>
@@ -5420,12 +5317,6 @@
         </w:tc>
       </w:tr>
       <w:tr>
-        <w:tblPrEx>
-          <w:tblCellMar>
-            <w:top w:w="0" w:type="dxa"/>
-            <w:bottom w:w="0" w:type="dxa"/>
-          </w:tblCellMar>
-        </w:tblPrEx>
         <w:tc>
           <w:tcPr>
             <w:tcW w:w="2808" w:type="dxa"/>
@@ -5472,18 +5363,19 @@
               <w:rPr>
                 <w:rFonts w:eastAsia="Arial"/>
               </w:rPr>
-              <w:t>Rules that determine the order in which operators are evaluated (* and / before + and -).</w:t>
+              <w:t xml:space="preserve">Rules that determine the order in which operators are evaluated (* and / before </w:t>
+            </w:r>
+            <w:r>
+              <w:rPr>
+                <w:rFonts w:eastAsia="Arial"/>
+              </w:rPr>
+              <w:lastRenderedPageBreak/>
+              <w:t>+ and -).</w:t>
             </w:r>
           </w:p>
         </w:tc>
       </w:tr>
       <w:tr>
-        <w:tblPrEx>
-          <w:tblCellMar>
-            <w:top w:w="0" w:type="dxa"/>
-            <w:bottom w:w="0" w:type="dxa"/>
-          </w:tblCellMar>
-        </w:tblPrEx>
         <w:tc>
           <w:tcPr>
             <w:tcW w:w="2808" w:type="dxa"/>
@@ -5505,6 +5397,7 @@
               <w:rPr>
                 <w:rFonts w:eastAsia="Arial"/>
               </w:rPr>
+              <w:lastRenderedPageBreak/>
               <w:t>Floating-point</w:t>
             </w:r>
           </w:p>
@@ -5559,7 +5452,6 @@
         </w:rPr>
       </w:pPr>
       <w:r>
-        <w:lastRenderedPageBreak/>
         <w:t>FAQ</w:t>
       </w:r>
       <w:r>

</xml_diff>

<commit_message>
Updated the Installation section and cleaned up the formatting of the User Manual
</commit_message>
<xml_diff>
--- a/doc/DOCX originals/Calculatorz_Users_Manual.docx
+++ b/doc/DOCX originals/Calculatorz_Users_Manual.docx
@@ -62,22 +62,6 @@
       <w:pPr>
         <w:jc w:val="right"/>
       </w:pPr>
-    </w:p>
-    <w:p>
-      <w:pPr>
-        <w:pStyle w:val="InfoBlue"/>
-      </w:pPr>
-      <w:r>
-        <w:t>[Note: The following template is provided for use with the Unified Process for EDUcation.  Text enclosed in square brackets and displayed in blue italics (style=InfoBlue) is included to provide guidance to the author and should be deleted before publishing the document. A paragraph entered following this style will automatically be set to normal (style=Body Text).]</w:t>
-      </w:r>
-    </w:p>
-    <w:p>
-      <w:pPr>
-        <w:pStyle w:val="InfoBlue"/>
-      </w:pPr>
-      <w:r>
-        <w:t xml:space="preserve">[To customize automatic fields (which display a gray background when selected), select File&gt;Properties and replace the Title, Subject and Company fields with the appropriate information for this document.    After closing the dialog, automatic fields may be updated throughout the document by selecting Edit&gt;Select All (or Ctrl-A) and pressing F9, or simply click on the field and press F9.  This must be done separately for Headers and Footers.  Alt-F9 will toggle between displaying the field names and the field contents.  See Word help for more information on working with fields.] </w:t>
-      </w:r>
     </w:p>
     <w:p>
       <w:pPr>
@@ -1283,6 +1267,16 @@
         </w:rPr>
         <w:t>Installation</w:t>
       </w:r>
+      <w:r>
+        <w:rPr>
+          <w:rFonts w:eastAsia="Arial" w:cs="Arial"/>
+          <w:bCs/>
+          <w:color w:val="000000"/>
+          <w:sz w:val="24"/>
+          <w:szCs w:val="24"/>
+        </w:rPr>
+        <w:t xml:space="preserve"> (Windows)</w:t>
+      </w:r>
     </w:p>
     <w:p>
       <w:pPr>
@@ -1370,6 +1364,230 @@
         </w:rPr>
         <w:t>The application window will open immediately.</w:t>
       </w:r>
+    </w:p>
+    <w:p>
+      <w:pPr>
+        <w:pStyle w:val="Heading2"/>
+        <w:rPr>
+          <w:rFonts w:eastAsia="Arial" w:cs="Arial"/>
+          <w:bCs/>
+          <w:color w:val="000000"/>
+          <w:sz w:val="24"/>
+          <w:szCs w:val="24"/>
+        </w:rPr>
+      </w:pPr>
+      <w:r>
+        <w:rPr>
+          <w:rFonts w:eastAsia="Arial" w:cs="Arial"/>
+          <w:bCs/>
+          <w:color w:val="000000"/>
+          <w:sz w:val="24"/>
+          <w:szCs w:val="24"/>
+        </w:rPr>
+        <w:t>Installation (</w:t>
+      </w:r>
+      <w:r>
+        <w:rPr>
+          <w:rFonts w:eastAsia="Arial" w:cs="Arial"/>
+          <w:bCs/>
+          <w:color w:val="000000"/>
+          <w:sz w:val="24"/>
+          <w:szCs w:val="24"/>
+        </w:rPr>
+        <w:t>MacOS</w:t>
+      </w:r>
+      <w:r>
+        <w:rPr>
+          <w:rFonts w:eastAsia="Arial" w:cs="Arial"/>
+          <w:bCs/>
+          <w:color w:val="000000"/>
+          <w:sz w:val="24"/>
+          <w:szCs w:val="24"/>
+        </w:rPr>
+        <w:t>)</w:t>
+      </w:r>
+    </w:p>
+    <w:p>
+      <w:pPr>
+        <w:pStyle w:val="ListParagraph"/>
+        <w:numPr>
+          <w:ilvl w:val="0"/>
+          <w:numId w:val="74"/>
+        </w:numPr>
+        <w:spacing w:before="60" w:after="60"/>
+        <w:rPr>
+          <w:rFonts w:ascii="Times New Roman" w:hAnsi="Times New Roman" w:cs="Times New Roman"/>
+          <w:sz w:val="20"/>
+          <w:szCs w:val="20"/>
+        </w:rPr>
+      </w:pPr>
+      <w:r>
+        <w:rPr>
+          <w:rFonts w:ascii="Times New Roman" w:hAnsi="Times New Roman" w:cs="Times New Roman"/>
+          <w:sz w:val="20"/>
+          <w:szCs w:val="20"/>
+        </w:rPr>
+        <w:t xml:space="preserve">Download the </w:t>
+      </w:r>
+      <w:proofErr w:type="spellStart"/>
+      <w:r>
+        <w:rPr>
+          <w:rFonts w:ascii="Times New Roman" w:hAnsi="Times New Roman" w:cs="Times New Roman"/>
+          <w:sz w:val="20"/>
+          <w:szCs w:val="20"/>
+        </w:rPr>
+        <w:t>Calculatorz</w:t>
+      </w:r>
+      <w:proofErr w:type="spellEnd"/>
+      <w:r>
+        <w:rPr>
+          <w:rFonts w:ascii="Times New Roman" w:hAnsi="Times New Roman" w:cs="Times New Roman"/>
+          <w:sz w:val="20"/>
+          <w:szCs w:val="20"/>
+        </w:rPr>
+        <w:t xml:space="preserve"> installer (.</w:t>
+      </w:r>
+      <w:r>
+        <w:rPr>
+          <w:rFonts w:ascii="Times New Roman" w:hAnsi="Times New Roman" w:cs="Times New Roman"/>
+          <w:sz w:val="20"/>
+          <w:szCs w:val="20"/>
+        </w:rPr>
+        <w:t>dmg</w:t>
+      </w:r>
+      <w:r>
+        <w:rPr>
+          <w:rFonts w:ascii="Times New Roman" w:hAnsi="Times New Roman" w:cs="Times New Roman"/>
+          <w:sz w:val="20"/>
+          <w:szCs w:val="20"/>
+        </w:rPr>
+        <w:t>) from the project distribution page.</w:t>
+      </w:r>
+    </w:p>
+    <w:p>
+      <w:pPr>
+        <w:pStyle w:val="ListParagraph"/>
+        <w:numPr>
+          <w:ilvl w:val="0"/>
+          <w:numId w:val="74"/>
+        </w:numPr>
+        <w:spacing w:before="60" w:after="60"/>
+        <w:rPr>
+          <w:rFonts w:ascii="Times New Roman" w:hAnsi="Times New Roman" w:cs="Times New Roman"/>
+          <w:sz w:val="20"/>
+          <w:szCs w:val="20"/>
+        </w:rPr>
+      </w:pPr>
+      <w:r>
+        <w:rPr>
+          <w:rFonts w:ascii="Times New Roman" w:hAnsi="Times New Roman" w:cs="Times New Roman"/>
+          <w:sz w:val="20"/>
+          <w:szCs w:val="20"/>
+        </w:rPr>
+        <w:t>Double</w:t>
+      </w:r>
+      <w:r>
+        <w:rPr>
+          <w:rFonts w:ascii="Times New Roman" w:hAnsi="Times New Roman" w:cs="Times New Roman"/>
+          <w:sz w:val="20"/>
+          <w:szCs w:val="20"/>
+        </w:rPr>
+        <w:t>-click the .</w:t>
+      </w:r>
+      <w:r>
+        <w:rPr>
+          <w:rFonts w:ascii="Times New Roman" w:hAnsi="Times New Roman" w:cs="Times New Roman"/>
+          <w:sz w:val="20"/>
+          <w:szCs w:val="20"/>
+        </w:rPr>
+        <w:t>dmg</w:t>
+      </w:r>
+      <w:r>
+        <w:rPr>
+          <w:rFonts w:ascii="Times New Roman" w:hAnsi="Times New Roman" w:cs="Times New Roman"/>
+          <w:sz w:val="20"/>
+          <w:szCs w:val="20"/>
+        </w:rPr>
+        <w:t xml:space="preserve"> file. </w:t>
+      </w:r>
+      <w:r>
+        <w:rPr>
+          <w:rFonts w:ascii="Times New Roman" w:hAnsi="Times New Roman" w:cs="Times New Roman"/>
+          <w:sz w:val="20"/>
+          <w:szCs w:val="20"/>
+        </w:rPr>
+        <w:t>Drag .app to desktop</w:t>
+      </w:r>
+      <w:r>
+        <w:rPr>
+          <w:rFonts w:ascii="Times New Roman" w:hAnsi="Times New Roman" w:cs="Times New Roman"/>
+          <w:sz w:val="20"/>
+          <w:szCs w:val="20"/>
+        </w:rPr>
+        <w:t>.</w:t>
+      </w:r>
+    </w:p>
+    <w:p>
+      <w:pPr>
+        <w:pStyle w:val="ListParagraph"/>
+        <w:numPr>
+          <w:ilvl w:val="0"/>
+          <w:numId w:val="74"/>
+        </w:numPr>
+        <w:spacing w:before="60" w:after="60"/>
+        <w:rPr>
+          <w:rFonts w:ascii="Times New Roman" w:hAnsi="Times New Roman" w:cs="Times New Roman"/>
+          <w:sz w:val="20"/>
+          <w:szCs w:val="20"/>
+        </w:rPr>
+      </w:pPr>
+      <w:r>
+        <w:rPr>
+          <w:rFonts w:ascii="Times New Roman" w:hAnsi="Times New Roman" w:cs="Times New Roman"/>
+          <w:sz w:val="20"/>
+          <w:szCs w:val="20"/>
+        </w:rPr>
+        <w:t>Right-click the .app file, and a pop-up will appear and press open</w:t>
+      </w:r>
+      <w:r>
+        <w:rPr>
+          <w:rFonts w:ascii="Times New Roman" w:hAnsi="Times New Roman" w:cs="Times New Roman"/>
+          <w:sz w:val="20"/>
+          <w:szCs w:val="20"/>
+        </w:rPr>
+        <w:t>.</w:t>
+      </w:r>
+    </w:p>
+    <w:p>
+      <w:pPr>
+        <w:pStyle w:val="ListParagraph"/>
+        <w:numPr>
+          <w:ilvl w:val="0"/>
+          <w:numId w:val="74"/>
+        </w:numPr>
+        <w:spacing w:before="60" w:after="60"/>
+        <w:rPr>
+          <w:rFonts w:ascii="Times New Roman" w:hAnsi="Times New Roman" w:cs="Times New Roman"/>
+          <w:sz w:val="20"/>
+          <w:szCs w:val="20"/>
+        </w:rPr>
+      </w:pPr>
+      <w:r>
+        <w:rPr>
+          <w:rFonts w:ascii="Times New Roman" w:hAnsi="Times New Roman" w:cs="Times New Roman"/>
+          <w:sz w:val="20"/>
+          <w:szCs w:val="20"/>
+        </w:rPr>
+        <w:t>The application window will open immediately.</w:t>
+      </w:r>
+    </w:p>
+    <w:p>
+      <w:pPr>
+        <w:rPr>
+          <w:i/>
+          <w:color w:val="0000FF"/>
+        </w:rPr>
+      </w:pPr>
     </w:p>
     <w:p>
       <w:pPr>
@@ -1516,7 +1734,6 @@
               <w:rPr>
                 <w:rFonts w:eastAsia="Arial"/>
               </w:rPr>
-              <w:lastRenderedPageBreak/>
               <w:t>0 – 9</w:t>
             </w:r>
           </w:p>
@@ -2245,17 +2462,6 @@
         </w:rPr>
         <w:t>Retype the corrected expression and press = again.</w:t>
       </w:r>
-    </w:p>
-    <w:p>
-      <w:pPr>
-        <w:pStyle w:val="BodyText1"/>
-        <w:spacing w:after="0" w:line="240" w:lineRule="atLeast"/>
-        <w:rPr>
-          <w:iCs/>
-          <w:color w:val="0000FF"/>
-          <w:lang w:val="en-US"/>
-        </w:rPr>
-      </w:pPr>
     </w:p>
     <w:p>
       <w:pPr>
@@ -2628,7 +2834,6 @@
               <w:rPr>
                 <w:rFonts w:eastAsia="Arial"/>
               </w:rPr>
-              <w:lastRenderedPageBreak/>
               <w:t>(2 + 3) * 4</w:t>
             </w:r>
           </w:p>
@@ -3316,6 +3521,105 @@
     </w:p>
     <w:p>
       <w:pPr>
+        <w:pStyle w:val="BodyText1"/>
+        <w:spacing w:after="0" w:line="240" w:lineRule="atLeast"/>
+        <w:rPr>
+          <w:b/>
+          <w:bCs/>
+          <w:lang w:val="en-US"/>
+        </w:rPr>
+      </w:pPr>
+    </w:p>
+    <w:p>
+      <w:pPr>
+        <w:pStyle w:val="BodyText1"/>
+        <w:spacing w:after="0" w:line="240" w:lineRule="atLeast"/>
+        <w:rPr>
+          <w:b/>
+          <w:bCs/>
+          <w:lang w:val="en-US"/>
+        </w:rPr>
+      </w:pPr>
+    </w:p>
+    <w:p>
+      <w:pPr>
+        <w:pStyle w:val="BodyText1"/>
+        <w:spacing w:after="0" w:line="240" w:lineRule="atLeast"/>
+        <w:rPr>
+          <w:b/>
+          <w:bCs/>
+          <w:lang w:val="en-US"/>
+        </w:rPr>
+      </w:pPr>
+    </w:p>
+    <w:p>
+      <w:pPr>
+        <w:pStyle w:val="BodyText1"/>
+        <w:spacing w:after="0" w:line="240" w:lineRule="atLeast"/>
+        <w:rPr>
+          <w:b/>
+          <w:bCs/>
+          <w:lang w:val="en-US"/>
+        </w:rPr>
+      </w:pPr>
+    </w:p>
+    <w:p>
+      <w:pPr>
+        <w:pStyle w:val="BodyText1"/>
+        <w:spacing w:after="0" w:line="240" w:lineRule="atLeast"/>
+        <w:rPr>
+          <w:b/>
+          <w:bCs/>
+          <w:lang w:val="en-US"/>
+        </w:rPr>
+      </w:pPr>
+    </w:p>
+    <w:p>
+      <w:pPr>
+        <w:pStyle w:val="BodyText1"/>
+        <w:spacing w:after="0" w:line="240" w:lineRule="atLeast"/>
+        <w:rPr>
+          <w:b/>
+          <w:bCs/>
+          <w:lang w:val="en-US"/>
+        </w:rPr>
+      </w:pPr>
+    </w:p>
+    <w:p>
+      <w:pPr>
+        <w:pStyle w:val="BodyText1"/>
+        <w:spacing w:after="0" w:line="240" w:lineRule="atLeast"/>
+        <w:rPr>
+          <w:b/>
+          <w:bCs/>
+          <w:lang w:val="en-US"/>
+        </w:rPr>
+      </w:pPr>
+    </w:p>
+    <w:p>
+      <w:pPr>
+        <w:pStyle w:val="BodyText1"/>
+        <w:spacing w:after="0" w:line="240" w:lineRule="atLeast"/>
+        <w:rPr>
+          <w:b/>
+          <w:bCs/>
+          <w:lang w:val="en-US"/>
+        </w:rPr>
+      </w:pPr>
+    </w:p>
+    <w:p>
+      <w:pPr>
+        <w:pStyle w:val="BodyText1"/>
+        <w:spacing w:after="0" w:line="240" w:lineRule="atLeast"/>
+        <w:rPr>
+          <w:b/>
+          <w:bCs/>
+          <w:lang w:val="en-US"/>
+        </w:rPr>
+      </w:pPr>
+    </w:p>
+    <w:p>
+      <w:pPr>
         <w:pStyle w:val="Heading1"/>
         <w:rPr>
           <w:b w:val="0"/>
@@ -3324,6 +3628,7 @@
       </w:pPr>
       <w:bookmarkStart w:id="13" w:name="_Toc5431514"/>
       <w:r>
+        <w:lastRenderedPageBreak/>
         <w:t>Troubleshooting</w:t>
       </w:r>
       <w:r>
@@ -3729,14 +4034,7 @@
               <w:rPr>
                 <w:rFonts w:eastAsia="Arial"/>
               </w:rPr>
-              <w:t xml:space="preserve">The expression contains a character </w:t>
-            </w:r>
-            <w:r>
-              <w:rPr>
-                <w:rFonts w:eastAsia="Arial"/>
-              </w:rPr>
-              <w:lastRenderedPageBreak/>
-              <w:t>that is not a digit, operator, decimal point, or parenthesis (e.g. 3 + x).</w:t>
+              <w:t>The expression contains a character that is not a digit, operator, decimal point, or parenthesis (e.g. 3 + x).</w:t>
             </w:r>
           </w:p>
         </w:tc>
@@ -3761,15 +4059,7 @@
               <w:rPr>
                 <w:rFonts w:eastAsia="Arial"/>
               </w:rPr>
-              <w:lastRenderedPageBreak/>
-              <w:t xml:space="preserve">Remove or replace the unsupported </w:t>
-            </w:r>
-            <w:r>
-              <w:rPr>
-                <w:rFonts w:eastAsia="Arial"/>
-              </w:rPr>
-              <w:lastRenderedPageBreak/>
-              <w:t>character.</w:t>
+              <w:t>Remove or replace the unsupported character.</w:t>
             </w:r>
           </w:p>
         </w:tc>
@@ -3796,7 +4086,6 @@
               <w:rPr>
                 <w:rFonts w:eastAsia="Arial"/>
               </w:rPr>
-              <w:lastRenderedPageBreak/>
               <w:t>Invalid negative number</w:t>
             </w:r>
           </w:p>
@@ -4851,12 +5140,17 @@
       </w:tr>
     </w:tbl>
     <w:p/>
+    <w:p/>
+    <w:p/>
+    <w:p/>
+    <w:p/>
     <w:bookmarkEnd w:id="14"/>
     <w:p>
       <w:pPr>
         <w:pStyle w:val="Heading1"/>
       </w:pPr>
       <w:r>
+        <w:lastRenderedPageBreak/>
         <w:t>Glossary of terms</w:t>
       </w:r>
       <w:bookmarkStart w:id="15" w:name="_Toc5431520"/>
@@ -5369,14 +5663,7 @@
               <w:rPr>
                 <w:rFonts w:eastAsia="Arial"/>
               </w:rPr>
-              <w:t xml:space="preserve">Rules that determine the order in which operators are evaluated (* and / before </w:t>
-            </w:r>
-            <w:r>
-              <w:rPr>
-                <w:rFonts w:eastAsia="Arial"/>
-              </w:rPr>
-              <w:lastRenderedPageBreak/>
-              <w:t>+ and -).</w:t>
+              <w:t>Rules that determine the order in which operators are evaluated (* and / before + and -).</w:t>
             </w:r>
           </w:p>
         </w:tc>
@@ -5403,7 +5690,6 @@
               <w:rPr>
                 <w:rFonts w:eastAsia="Arial"/>
               </w:rPr>
-              <w:lastRenderedPageBreak/>
               <w:t>Floating-point</w:t>
             </w:r>
           </w:p>
@@ -6961,6 +7247,95 @@
     </w:lvl>
   </w:abstractNum>
   <w:abstractNum w:abstractNumId="39" w15:restartNumberingAfterBreak="0">
+    <w:nsid w:val="71D5486F"/>
+    <w:multiLevelType w:val="hybridMultilevel"/>
+    <w:tmpl w:val="C9D6D33E"/>
+    <w:lvl w:ilvl="0" w:tplc="0409000F">
+      <w:start w:val="1"/>
+      <w:numFmt w:val="decimal"/>
+      <w:lvlText w:val="%1."/>
+      <w:lvlJc w:val="left"/>
+      <w:pPr>
+        <w:ind w:left="720" w:hanging="360"/>
+      </w:pPr>
+      <w:rPr>
+        <w:rFonts w:hint="default"/>
+      </w:rPr>
+    </w:lvl>
+    <w:lvl w:ilvl="1" w:tplc="04090019" w:tentative="1">
+      <w:start w:val="1"/>
+      <w:numFmt w:val="lowerLetter"/>
+      <w:lvlText w:val="%2."/>
+      <w:lvlJc w:val="left"/>
+      <w:pPr>
+        <w:ind w:left="1440" w:hanging="360"/>
+      </w:pPr>
+    </w:lvl>
+    <w:lvl w:ilvl="2" w:tplc="0409001B" w:tentative="1">
+      <w:start w:val="1"/>
+      <w:numFmt w:val="lowerRoman"/>
+      <w:lvlText w:val="%3."/>
+      <w:lvlJc w:val="right"/>
+      <w:pPr>
+        <w:ind w:left="2160" w:hanging="180"/>
+      </w:pPr>
+    </w:lvl>
+    <w:lvl w:ilvl="3" w:tplc="0409000F" w:tentative="1">
+      <w:start w:val="1"/>
+      <w:numFmt w:val="decimal"/>
+      <w:lvlText w:val="%4."/>
+      <w:lvlJc w:val="left"/>
+      <w:pPr>
+        <w:ind w:left="2880" w:hanging="360"/>
+      </w:pPr>
+    </w:lvl>
+    <w:lvl w:ilvl="4" w:tplc="04090019" w:tentative="1">
+      <w:start w:val="1"/>
+      <w:numFmt w:val="lowerLetter"/>
+      <w:lvlText w:val="%5."/>
+      <w:lvlJc w:val="left"/>
+      <w:pPr>
+        <w:ind w:left="3600" w:hanging="360"/>
+      </w:pPr>
+    </w:lvl>
+    <w:lvl w:ilvl="5" w:tplc="0409001B" w:tentative="1">
+      <w:start w:val="1"/>
+      <w:numFmt w:val="lowerRoman"/>
+      <w:lvlText w:val="%6."/>
+      <w:lvlJc w:val="right"/>
+      <w:pPr>
+        <w:ind w:left="4320" w:hanging="180"/>
+      </w:pPr>
+    </w:lvl>
+    <w:lvl w:ilvl="6" w:tplc="0409000F" w:tentative="1">
+      <w:start w:val="1"/>
+      <w:numFmt w:val="decimal"/>
+      <w:lvlText w:val="%7."/>
+      <w:lvlJc w:val="left"/>
+      <w:pPr>
+        <w:ind w:left="5040" w:hanging="360"/>
+      </w:pPr>
+    </w:lvl>
+    <w:lvl w:ilvl="7" w:tplc="04090019" w:tentative="1">
+      <w:start w:val="1"/>
+      <w:numFmt w:val="lowerLetter"/>
+      <w:lvlText w:val="%8."/>
+      <w:lvlJc w:val="left"/>
+      <w:pPr>
+        <w:ind w:left="5760" w:hanging="360"/>
+      </w:pPr>
+    </w:lvl>
+    <w:lvl w:ilvl="8" w:tplc="0409001B" w:tentative="1">
+      <w:start w:val="1"/>
+      <w:numFmt w:val="lowerRoman"/>
+      <w:lvlText w:val="%9."/>
+      <w:lvlJc w:val="right"/>
+      <w:pPr>
+        <w:ind w:left="6480" w:hanging="180"/>
+      </w:pPr>
+    </w:lvl>
+  </w:abstractNum>
+  <w:abstractNum w:abstractNumId="40" w15:restartNumberingAfterBreak="0">
     <w:nsid w:val="71F21F2A"/>
     <w:multiLevelType w:val="singleLevel"/>
     <w:tmpl w:val="04090001"/>
@@ -6980,7 +7355,7 @@
       </w:rPr>
     </w:lvl>
   </w:abstractNum>
-  <w:abstractNum w:abstractNumId="40" w15:restartNumberingAfterBreak="0">
+  <w:abstractNum w:abstractNumId="41" w15:restartNumberingAfterBreak="0">
     <w:nsid w:val="73653922"/>
     <w:multiLevelType w:val="singleLevel"/>
     <w:tmpl w:val="04090001"/>
@@ -7000,7 +7375,7 @@
       </w:rPr>
     </w:lvl>
   </w:abstractNum>
-  <w:abstractNum w:abstractNumId="41" w15:restartNumberingAfterBreak="0">
+  <w:abstractNum w:abstractNumId="42" w15:restartNumberingAfterBreak="0">
     <w:nsid w:val="743601FB"/>
     <w:multiLevelType w:val="singleLevel"/>
     <w:tmpl w:val="04090001"/>
@@ -7020,7 +7395,7 @@
       </w:rPr>
     </w:lvl>
   </w:abstractNum>
-  <w:abstractNum w:abstractNumId="42" w15:restartNumberingAfterBreak="0">
+  <w:abstractNum w:abstractNumId="43" w15:restartNumberingAfterBreak="0">
     <w:nsid w:val="756150CA"/>
     <w:multiLevelType w:val="singleLevel"/>
     <w:tmpl w:val="04090001"/>
@@ -7040,7 +7415,7 @@
       </w:rPr>
     </w:lvl>
   </w:abstractNum>
-  <w:abstractNum w:abstractNumId="43" w15:restartNumberingAfterBreak="0">
+  <w:abstractNum w:abstractNumId="44" w15:restartNumberingAfterBreak="0">
     <w:nsid w:val="76706FC5"/>
     <w:multiLevelType w:val="hybridMultilevel"/>
     <w:tmpl w:val="4D24DC6E"/>
@@ -7094,7 +7469,7 @@
       <w:lvlJc w:val="left"/>
     </w:lvl>
   </w:abstractNum>
-  <w:abstractNum w:abstractNumId="44" w15:restartNumberingAfterBreak="0">
+  <w:abstractNum w:abstractNumId="45" w15:restartNumberingAfterBreak="0">
     <w:nsid w:val="770D055C"/>
     <w:multiLevelType w:val="singleLevel"/>
     <w:tmpl w:val="04090001"/>
@@ -7114,7 +7489,7 @@
       </w:rPr>
     </w:lvl>
   </w:abstractNum>
-  <w:abstractNum w:abstractNumId="45" w15:restartNumberingAfterBreak="0">
+  <w:abstractNum w:abstractNumId="46" w15:restartNumberingAfterBreak="0">
     <w:nsid w:val="779F6A22"/>
     <w:multiLevelType w:val="singleLevel"/>
     <w:tmpl w:val="04090001"/>
@@ -7134,7 +7509,7 @@
       </w:rPr>
     </w:lvl>
   </w:abstractNum>
-  <w:abstractNum w:abstractNumId="46" w15:restartNumberingAfterBreak="0">
+  <w:abstractNum w:abstractNumId="47" w15:restartNumberingAfterBreak="0">
     <w:nsid w:val="78E118A3"/>
     <w:multiLevelType w:val="hybridMultilevel"/>
     <w:tmpl w:val="BE3EE40C"/>
@@ -7188,7 +7563,7 @@
       <w:lvlJc w:val="left"/>
     </w:lvl>
   </w:abstractNum>
-  <w:abstractNum w:abstractNumId="47" w15:restartNumberingAfterBreak="0">
+  <w:abstractNum w:abstractNumId="48" w15:restartNumberingAfterBreak="0">
     <w:nsid w:val="7B204FE1"/>
     <w:multiLevelType w:val="singleLevel"/>
     <w:tmpl w:val="04090001"/>
@@ -7208,7 +7583,7 @@
       </w:rPr>
     </w:lvl>
   </w:abstractNum>
-  <w:abstractNum w:abstractNumId="48" w15:restartNumberingAfterBreak="0">
+  <w:abstractNum w:abstractNumId="49" w15:restartNumberingAfterBreak="0">
     <w:nsid w:val="7BE434D7"/>
     <w:multiLevelType w:val="singleLevel"/>
     <w:tmpl w:val="04090001"/>
@@ -7228,7 +7603,7 @@
       </w:rPr>
     </w:lvl>
   </w:abstractNum>
-  <w:abstractNum w:abstractNumId="49" w15:restartNumberingAfterBreak="0">
+  <w:abstractNum w:abstractNumId="50" w15:restartNumberingAfterBreak="0">
     <w:nsid w:val="7C4777D2"/>
     <w:multiLevelType w:val="singleLevel"/>
     <w:tmpl w:val="FFFFFFFF"/>
@@ -7247,7 +7622,7 @@
     <w:abstractNumId w:val="22"/>
   </w:num>
   <w:num w:numId="3" w16cid:durableId="452871087">
-    <w:abstractNumId w:val="48"/>
+    <w:abstractNumId w:val="49"/>
   </w:num>
   <w:num w:numId="4" w16cid:durableId="1329283520">
     <w:abstractNumId w:val="34"/>
@@ -7276,7 +7651,7 @@
     <w:abstractNumId w:val="2"/>
   </w:num>
   <w:num w:numId="8" w16cid:durableId="700515442">
-    <w:abstractNumId w:val="42"/>
+    <w:abstractNumId w:val="43"/>
   </w:num>
   <w:num w:numId="9" w16cid:durableId="1141777103">
     <w:abstractNumId w:val="3"/>
@@ -7288,7 +7663,7 @@
     <w:abstractNumId w:val="21"/>
   </w:num>
   <w:num w:numId="12" w16cid:durableId="971902261">
-    <w:abstractNumId w:val="41"/>
+    <w:abstractNumId w:val="42"/>
   </w:num>
   <w:num w:numId="13" w16cid:durableId="1503353038">
     <w:abstractNumId w:val="19"/>
@@ -7297,7 +7672,7 @@
     <w:abstractNumId w:val="8"/>
   </w:num>
   <w:num w:numId="15" w16cid:durableId="1227642299">
-    <w:abstractNumId w:val="39"/>
+    <w:abstractNumId w:val="40"/>
   </w:num>
   <w:num w:numId="16" w16cid:durableId="997153989">
     <w:abstractNumId w:val="30"/>
@@ -7390,7 +7765,7 @@
     <w:abstractNumId w:val="16"/>
   </w:num>
   <w:num w:numId="36" w16cid:durableId="859124039">
-    <w:abstractNumId w:val="49"/>
+    <w:abstractNumId w:val="50"/>
   </w:num>
   <w:num w:numId="37" w16cid:durableId="600338446">
     <w:abstractNumId w:val="7"/>
@@ -7417,7 +7792,7 @@
     <w:abstractNumId w:val="11"/>
   </w:num>
   <w:num w:numId="45" w16cid:durableId="1497499237">
-    <w:abstractNumId w:val="45"/>
+    <w:abstractNumId w:val="46"/>
   </w:num>
   <w:num w:numId="46" w16cid:durableId="324670887">
     <w:abstractNumId w:val="36"/>
@@ -7429,7 +7804,7 @@
     <w:abstractNumId w:val="18"/>
   </w:num>
   <w:num w:numId="49" w16cid:durableId="1468007894">
-    <w:abstractNumId w:val="44"/>
+    <w:abstractNumId w:val="45"/>
   </w:num>
   <w:num w:numId="50" w16cid:durableId="24916760">
     <w:abstractNumId w:val="27"/>
@@ -7447,13 +7822,13 @@
     <w:abstractNumId w:val="24"/>
   </w:num>
   <w:num w:numId="55" w16cid:durableId="1236623220">
-    <w:abstractNumId w:val="40"/>
+    <w:abstractNumId w:val="41"/>
   </w:num>
   <w:num w:numId="56" w16cid:durableId="499857102">
     <w:abstractNumId w:val="4"/>
   </w:num>
   <w:num w:numId="57" w16cid:durableId="812797749">
-    <w:abstractNumId w:val="47"/>
+    <w:abstractNumId w:val="48"/>
   </w:num>
   <w:num w:numId="58" w16cid:durableId="1900091817">
     <w:abstractNumId w:val="0"/>
@@ -7498,16 +7873,19 @@
     <w:abstractNumId w:val="9"/>
   </w:num>
   <w:num w:numId="72" w16cid:durableId="8454364">
-    <w:abstractNumId w:val="43"/>
+    <w:abstractNumId w:val="44"/>
     <w:lvlOverride w:ilvl="0">
       <w:startOverride w:val="1"/>
     </w:lvlOverride>
   </w:num>
   <w:num w:numId="73" w16cid:durableId="24911703">
-    <w:abstractNumId w:val="46"/>
+    <w:abstractNumId w:val="47"/>
     <w:lvlOverride w:ilvl="0">
       <w:startOverride w:val="1"/>
     </w:lvlOverride>
+  </w:num>
+  <w:num w:numId="74" w16cid:durableId="1816944758">
+    <w:abstractNumId w:val="39"/>
   </w:num>
 </w:numbering>
 </file>

</xml_diff>

<commit_message>
Updated User Manual to include: Unary Plus, and Exponent and Modulo Functions
</commit_message>
<xml_diff>
--- a/doc/DOCX originals/Calculatorz_Users_Manual.docx
+++ b/doc/DOCX originals/Calculatorz_Users_Manual.docx
@@ -1000,7 +1000,7 @@
     <w:p>
       <w:pPr>
         <w:pStyle w:val="BodyText1"/>
-        <w:ind w:firstLine="720"/>
+        <w:ind w:left="720"/>
         <w:rPr>
           <w:lang w:val="en-US"/>
         </w:rPr>
@@ -1021,7 +1021,25 @@
         <w:rPr>
           <w:lang w:val="en-US"/>
         </w:rPr>
-        <w:t>All four arithmetic operations: addition (+), subtraction (−), multiplication (*), and division (/).</w:t>
+        <w:t>A</w:t>
+      </w:r>
+      <w:r>
+        <w:rPr>
+          <w:lang w:val="en-US"/>
+        </w:rPr>
+        <w:t>rithmetic operations: addition (+), subtraction (−), multiplication (*), division (/)</w:t>
+      </w:r>
+      <w:r>
+        <w:rPr>
+          <w:lang w:val="en-US"/>
+        </w:rPr>
+        <w:t>, exponents (^), and modulo (%)</w:t>
+      </w:r>
+      <w:r>
+        <w:rPr>
+          <w:lang w:val="en-US"/>
+        </w:rPr>
+        <w:t>.</w:t>
       </w:r>
     </w:p>
     <w:p>
@@ -1102,7 +1120,19 @@
         <w:rPr>
           <w:lang w:val="en-US"/>
         </w:rPr>
-        <w:t>Unary minus support for negative number literals (e.g. -3 * 2).</w:t>
+        <w:t xml:space="preserve">Unary </w:t>
+      </w:r>
+      <w:r>
+        <w:rPr>
+          <w:lang w:val="en-US"/>
+        </w:rPr>
+        <w:t xml:space="preserve">plus and </w:t>
+      </w:r>
+      <w:r>
+        <w:rPr>
+          <w:lang w:val="en-US"/>
+        </w:rPr>
+        <w:t>minus support for negative number literals (e.g. -3 * 2).</w:t>
       </w:r>
     </w:p>
     <w:p>
@@ -1384,27 +1414,7 @@
           <w:sz w:val="24"/>
           <w:szCs w:val="24"/>
         </w:rPr>
-        <w:t>Installation (</w:t>
-      </w:r>
-      <w:r>
-        <w:rPr>
-          <w:rFonts w:eastAsia="Arial" w:cs="Arial"/>
-          <w:bCs/>
-          <w:color w:val="000000"/>
-          <w:sz w:val="24"/>
-          <w:szCs w:val="24"/>
-        </w:rPr>
-        <w:t>MacOS</w:t>
-      </w:r>
-      <w:r>
-        <w:rPr>
-          <w:rFonts w:eastAsia="Arial" w:cs="Arial"/>
-          <w:bCs/>
-          <w:color w:val="000000"/>
-          <w:sz w:val="24"/>
-          <w:szCs w:val="24"/>
-        </w:rPr>
-        <w:t>)</w:t>
+        <w:t>Installation (MacOS)</w:t>
       </w:r>
     </w:p>
     <w:p>
@@ -2106,6 +2116,68 @@
             </w:tcMar>
           </w:tcPr>
           <w:p>
+            <w:pPr>
+              <w:rPr>
+                <w:color w:val="000000"/>
+              </w:rPr>
+            </w:pPr>
+            <w:r>
+              <w:rPr>
+                <w:color w:val="000000"/>
+              </w:rPr>
+              <w:t>%</w:t>
+            </w:r>
+          </w:p>
+        </w:tc>
+        <w:tc>
+          <w:tcPr>
+            <w:tcW w:w="6240" w:type="dxa"/>
+            <w:tcBorders>
+              <w:top w:val="single" w:sz="1" w:space="0" w:color="CCCCCC"/>
+              <w:left w:val="single" w:sz="1" w:space="0" w:color="CCCCCC"/>
+              <w:bottom w:val="single" w:sz="1" w:space="0" w:color="CCCCCC"/>
+              <w:right w:val="single" w:sz="1" w:space="0" w:color="CCCCCC"/>
+            </w:tcBorders>
+            <w:tcMar>
+              <w:top w:w="80" w:type="dxa"/>
+              <w:left w:w="120" w:type="dxa"/>
+              <w:bottom w:w="80" w:type="dxa"/>
+              <w:right w:w="120" w:type="dxa"/>
+            </w:tcMar>
+          </w:tcPr>
+          <w:p>
+            <w:pPr>
+              <w:rPr>
+                <w:rFonts w:eastAsia="Arial"/>
+              </w:rPr>
+            </w:pPr>
+            <w:r>
+              <w:rPr>
+                <w:rFonts w:eastAsia="Arial"/>
+              </w:rPr>
+              <w:t>Modulo</w:t>
+            </w:r>
+          </w:p>
+        </w:tc>
+      </w:tr>
+      <w:tr>
+        <w:tc>
+          <w:tcPr>
+            <w:tcW w:w="3120" w:type="dxa"/>
+            <w:tcBorders>
+              <w:top w:val="single" w:sz="1" w:space="0" w:color="CCCCCC"/>
+              <w:left w:val="single" w:sz="1" w:space="0" w:color="CCCCCC"/>
+              <w:bottom w:val="single" w:sz="1" w:space="0" w:color="CCCCCC"/>
+              <w:right w:val="single" w:sz="1" w:space="0" w:color="CCCCCC"/>
+            </w:tcBorders>
+            <w:tcMar>
+              <w:top w:w="80" w:type="dxa"/>
+              <w:left w:w="120" w:type="dxa"/>
+              <w:bottom w:w="80" w:type="dxa"/>
+              <w:right w:w="120" w:type="dxa"/>
+            </w:tcMar>
+          </w:tcPr>
+          <w:p>
             <w:r>
               <w:rPr>
                 <w:rFonts w:eastAsia="Arial"/>
@@ -2465,23 +2537,34 @@
     </w:p>
     <w:p>
       <w:pPr>
-        <w:pStyle w:val="BodyText1"/>
-        <w:spacing w:after="0" w:line="240" w:lineRule="atLeast"/>
-        <w:rPr>
-          <w:iCs/>
-          <w:color w:val="0000FF"/>
-          <w:lang w:val="en-US"/>
-        </w:rPr>
-      </w:pPr>
-    </w:p>
-    <w:p>
-      <w:pPr>
-        <w:pStyle w:val="BodyText1"/>
-        <w:spacing w:after="0" w:line="240" w:lineRule="atLeast"/>
-        <w:rPr>
-          <w:iCs/>
-          <w:color w:val="0000FF"/>
-          <w:lang w:val="en-US"/>
+        <w:pStyle w:val="ListParagraph"/>
+        <w:spacing w:before="60" w:after="60"/>
+        <w:rPr>
+          <w:rFonts w:ascii="Times New Roman" w:hAnsi="Times New Roman" w:cs="Times New Roman"/>
+          <w:sz w:val="20"/>
+          <w:szCs w:val="20"/>
+        </w:rPr>
+      </w:pPr>
+    </w:p>
+    <w:p>
+      <w:pPr>
+        <w:pStyle w:val="ListParagraph"/>
+        <w:spacing w:before="60" w:after="60"/>
+        <w:rPr>
+          <w:rFonts w:ascii="Times New Roman" w:hAnsi="Times New Roman" w:cs="Times New Roman"/>
+          <w:sz w:val="20"/>
+          <w:szCs w:val="20"/>
+        </w:rPr>
+      </w:pPr>
+    </w:p>
+    <w:p>
+      <w:pPr>
+        <w:pStyle w:val="ListParagraph"/>
+        <w:spacing w:before="60" w:after="60"/>
+        <w:rPr>
+          <w:rFonts w:ascii="Times New Roman" w:hAnsi="Times New Roman" w:cs="Times New Roman"/>
+          <w:sz w:val="20"/>
+          <w:szCs w:val="20"/>
         </w:rPr>
       </w:pPr>
     </w:p>
@@ -2491,6 +2574,7 @@
       </w:pPr>
       <w:bookmarkStart w:id="12" w:name="_Toc5431513"/>
       <w:r>
+        <w:lastRenderedPageBreak/>
         <w:t>Advanced features</w:t>
       </w:r>
       <w:bookmarkEnd w:id="12"/>
@@ -3507,94 +3591,6 @@
         </w:rPr>
         <w:t>Every successfully evaluated expression is stored in the history panel. You can scroll through previous entries and click any item to load it back into the input field for re-evaluation or editing.</w:t>
       </w:r>
-    </w:p>
-    <w:p>
-      <w:pPr>
-        <w:pStyle w:val="BodyText1"/>
-        <w:spacing w:after="0" w:line="240" w:lineRule="atLeast"/>
-        <w:rPr>
-          <w:b/>
-          <w:bCs/>
-          <w:lang w:val="en-US"/>
-        </w:rPr>
-      </w:pPr>
-    </w:p>
-    <w:p>
-      <w:pPr>
-        <w:pStyle w:val="BodyText1"/>
-        <w:spacing w:after="0" w:line="240" w:lineRule="atLeast"/>
-        <w:rPr>
-          <w:b/>
-          <w:bCs/>
-          <w:lang w:val="en-US"/>
-        </w:rPr>
-      </w:pPr>
-    </w:p>
-    <w:p>
-      <w:pPr>
-        <w:pStyle w:val="BodyText1"/>
-        <w:spacing w:after="0" w:line="240" w:lineRule="atLeast"/>
-        <w:rPr>
-          <w:b/>
-          <w:bCs/>
-          <w:lang w:val="en-US"/>
-        </w:rPr>
-      </w:pPr>
-    </w:p>
-    <w:p>
-      <w:pPr>
-        <w:pStyle w:val="BodyText1"/>
-        <w:spacing w:after="0" w:line="240" w:lineRule="atLeast"/>
-        <w:rPr>
-          <w:b/>
-          <w:bCs/>
-          <w:lang w:val="en-US"/>
-        </w:rPr>
-      </w:pPr>
-    </w:p>
-    <w:p>
-      <w:pPr>
-        <w:pStyle w:val="BodyText1"/>
-        <w:spacing w:after="0" w:line="240" w:lineRule="atLeast"/>
-        <w:rPr>
-          <w:b/>
-          <w:bCs/>
-          <w:lang w:val="en-US"/>
-        </w:rPr>
-      </w:pPr>
-    </w:p>
-    <w:p>
-      <w:pPr>
-        <w:pStyle w:val="BodyText1"/>
-        <w:spacing w:after="0" w:line="240" w:lineRule="atLeast"/>
-        <w:rPr>
-          <w:b/>
-          <w:bCs/>
-          <w:lang w:val="en-US"/>
-        </w:rPr>
-      </w:pPr>
-    </w:p>
-    <w:p>
-      <w:pPr>
-        <w:pStyle w:val="BodyText1"/>
-        <w:spacing w:after="0" w:line="240" w:lineRule="atLeast"/>
-        <w:rPr>
-          <w:b/>
-          <w:bCs/>
-          <w:lang w:val="en-US"/>
-        </w:rPr>
-      </w:pPr>
-    </w:p>
-    <w:p>
-      <w:pPr>
-        <w:pStyle w:val="BodyText1"/>
-        <w:spacing w:after="0" w:line="240" w:lineRule="atLeast"/>
-        <w:rPr>
-          <w:b/>
-          <w:bCs/>
-          <w:lang w:val="en-US"/>
-        </w:rPr>
-      </w:pPr>
     </w:p>
     <w:p>
       <w:pPr>

</xml_diff>

<commit_message>
updated user manual and README to reflect work around MacOS quarantine
</commit_message>
<xml_diff>
--- a/doc/DOCX originals/Calculatorz_Users_Manual.docx
+++ b/doc/DOCX originals/Calculatorz_Users_Manual.docx
@@ -1253,15 +1253,6 @@
         <w:pStyle w:val="BodyText1"/>
         <w:spacing w:after="0" w:line="240" w:lineRule="atLeast"/>
         <w:rPr>
-          <w:lang w:val="en-US"/>
-        </w:rPr>
-      </w:pPr>
-    </w:p>
-    <w:p>
-      <w:pPr>
-        <w:pStyle w:val="BodyText1"/>
-        <w:spacing w:after="0" w:line="240" w:lineRule="atLeast"/>
-        <w:rPr>
           <w:i/>
           <w:color w:val="0000FF"/>
           <w:lang w:val="en-US"/>
@@ -1526,7 +1517,15 @@
           <w:sz w:val="20"/>
           <w:szCs w:val="20"/>
         </w:rPr>
-        <w:t>Drag .app to desktop</w:t>
+        <w:t xml:space="preserve">Drag .app </w:t>
+      </w:r>
+      <w:r>
+        <w:rPr>
+          <w:rFonts w:ascii="Times New Roman" w:hAnsi="Times New Roman" w:cs="Times New Roman"/>
+          <w:sz w:val="20"/>
+          <w:szCs w:val="20"/>
+        </w:rPr>
+        <w:t>into applications</w:t>
       </w:r>
       <w:r>
         <w:rPr>
@@ -1557,16 +1556,141 @@
           <w:sz w:val="20"/>
           <w:szCs w:val="20"/>
         </w:rPr>
-        <w:t>Right-click the .app file, and a pop-up will appear and press open</w:t>
-      </w:r>
-      <w:r>
+        <w:t>Open terminal and enter this command</w:t>
+      </w:r>
+    </w:p>
+    <w:p>
+      <w:pPr>
+        <w:pStyle w:val="ListParagraph"/>
+        <w:numPr>
+          <w:ilvl w:val="1"/>
+          <w:numId w:val="74"/>
+        </w:numPr>
+        <w:spacing w:before="60" w:after="60"/>
         <w:rPr>
           <w:rFonts w:ascii="Times New Roman" w:hAnsi="Times New Roman" w:cs="Times New Roman"/>
+          <w:color w:val="000000" w:themeColor="text1"/>
           <w:sz w:val="20"/>
           <w:szCs w:val="20"/>
         </w:rPr>
-        <w:t>.</w:t>
-      </w:r>
+      </w:pPr>
+      <w:proofErr w:type="spellStart"/>
+      <w:r>
+        <w:rPr>
+          <w:rStyle w:val="10"/>
+          <w:rFonts w:ascii="Times New Roman" w:hAnsi="Times New Roman" w:cs="Times New Roman"/>
+          <w:color w:val="000000" w:themeColor="text1"/>
+          <w:sz w:val="20"/>
+          <w:szCs w:val="20"/>
+        </w:rPr>
+        <w:t>sudo</w:t>
+      </w:r>
+      <w:proofErr w:type="spellEnd"/>
+      <w:r>
+        <w:rPr>
+          <w:rStyle w:val="apple-converted-space"/>
+          <w:rFonts w:ascii="Times New Roman" w:hAnsi="Times New Roman" w:cs="Times New Roman"/>
+          <w:color w:val="000000" w:themeColor="text1"/>
+          <w:sz w:val="20"/>
+          <w:szCs w:val="20"/>
+        </w:rPr>
+        <w:t> </w:t>
+      </w:r>
+      <w:proofErr w:type="spellStart"/>
+      <w:r>
+        <w:rPr>
+          <w:rFonts w:ascii="Times New Roman" w:hAnsi="Times New Roman" w:cs="Times New Roman"/>
+          <w:color w:val="000000" w:themeColor="text1"/>
+          <w:sz w:val="20"/>
+          <w:szCs w:val="20"/>
+        </w:rPr>
+        <w:t>xattr</w:t>
+      </w:r>
+      <w:proofErr w:type="spellEnd"/>
+      <w:r>
+        <w:rPr>
+          <w:rStyle w:val="apple-converted-space"/>
+          <w:rFonts w:ascii="Times New Roman" w:hAnsi="Times New Roman" w:cs="Times New Roman"/>
+          <w:color w:val="000000" w:themeColor="text1"/>
+          <w:sz w:val="20"/>
+          <w:szCs w:val="20"/>
+        </w:rPr>
+        <w:t> </w:t>
+      </w:r>
+      <w:r>
+        <w:rPr>
+          <w:rStyle w:val="12"/>
+          <w:rFonts w:ascii="Times New Roman" w:hAnsi="Times New Roman" w:cs="Times New Roman"/>
+          <w:color w:val="000000" w:themeColor="text1"/>
+          <w:sz w:val="20"/>
+          <w:szCs w:val="20"/>
+        </w:rPr>
+        <w:t>-</w:t>
+      </w:r>
+      <w:proofErr w:type="spellStart"/>
+      <w:r>
+        <w:rPr>
+          <w:rStyle w:val="12"/>
+          <w:rFonts w:ascii="Times New Roman" w:hAnsi="Times New Roman" w:cs="Times New Roman"/>
+          <w:color w:val="000000" w:themeColor="text1"/>
+          <w:sz w:val="20"/>
+          <w:szCs w:val="20"/>
+        </w:rPr>
+        <w:t>rd</w:t>
+      </w:r>
+      <w:proofErr w:type="spellEnd"/>
+      <w:r>
+        <w:rPr>
+          <w:rStyle w:val="apple-converted-space"/>
+          <w:rFonts w:ascii="Times New Roman" w:hAnsi="Times New Roman" w:cs="Times New Roman"/>
+          <w:color w:val="000000" w:themeColor="text1"/>
+          <w:sz w:val="20"/>
+          <w:szCs w:val="20"/>
+        </w:rPr>
+        <w:t> </w:t>
+      </w:r>
+      <w:proofErr w:type="spellStart"/>
+      <w:proofErr w:type="gramStart"/>
+      <w:r>
+        <w:rPr>
+          <w:rFonts w:ascii="Times New Roman" w:hAnsi="Times New Roman" w:cs="Times New Roman"/>
+          <w:color w:val="000000" w:themeColor="text1"/>
+          <w:sz w:val="20"/>
+          <w:szCs w:val="20"/>
+        </w:rPr>
+        <w:t>com.apple</w:t>
+      </w:r>
+      <w:proofErr w:type="gramEnd"/>
+      <w:r>
+        <w:rPr>
+          <w:rFonts w:ascii="Times New Roman" w:hAnsi="Times New Roman" w:cs="Times New Roman"/>
+          <w:color w:val="000000" w:themeColor="text1"/>
+          <w:sz w:val="20"/>
+          <w:szCs w:val="20"/>
+        </w:rPr>
+        <w:t>.quarantine</w:t>
+      </w:r>
+      <w:proofErr w:type="spellEnd"/>
+      <w:r>
+        <w:rPr>
+          <w:rFonts w:ascii="Times New Roman" w:hAnsi="Times New Roman" w:cs="Times New Roman"/>
+          <w:color w:val="000000" w:themeColor="text1"/>
+          <w:sz w:val="20"/>
+          <w:szCs w:val="20"/>
+        </w:rPr>
+        <w:t xml:space="preserve"> /Applications/</w:t>
+      </w:r>
+      <w:proofErr w:type="spellStart"/>
+      <w:r>
+        <w:rPr>
+          <w:rFonts w:ascii="Times New Roman" w:hAnsi="Times New Roman" w:cs="Times New Roman"/>
+          <w:color w:val="000000" w:themeColor="text1"/>
+          <w:sz w:val="20"/>
+          <w:szCs w:val="20"/>
+        </w:rPr>
+        <w:t>CalcTTRPG.app</w:t>
+      </w:r>
+      <w:proofErr w:type="spellEnd"/>
     </w:p>
     <w:p>
       <w:pPr>
@@ -1588,7 +1712,7 @@
           <w:sz w:val="20"/>
           <w:szCs w:val="20"/>
         </w:rPr>
-        <w:t>The application window will open immediately.</w:t>
+        <w:t>Open the application</w:t>
       </w:r>
     </w:p>
     <w:p>
@@ -7212,7 +7336,7 @@
         <w:rFonts w:hint="default"/>
       </w:rPr>
     </w:lvl>
-    <w:lvl w:ilvl="1" w:tplc="04090019" w:tentative="1">
+    <w:lvl w:ilvl="1" w:tplc="04090019">
       <w:start w:val="1"/>
       <w:numFmt w:val="lowerLetter"/>
       <w:lvlText w:val="%2."/>
@@ -8893,6 +9017,21 @@
       <w:szCs w:val="22"/>
     </w:rPr>
   </w:style>
+  <w:style w:type="character" w:customStyle="1" w:styleId="10">
+    <w:name w:val="ͼ10"/>
+    <w:basedOn w:val="DefaultParagraphFont"/>
+    <w:rsid w:val="00CC7BE5"/>
+  </w:style>
+  <w:style w:type="character" w:customStyle="1" w:styleId="apple-converted-space">
+    <w:name w:val="apple-converted-space"/>
+    <w:basedOn w:val="DefaultParagraphFont"/>
+    <w:rsid w:val="00CC7BE5"/>
+  </w:style>
+  <w:style w:type="character" w:customStyle="1" w:styleId="12">
+    <w:name w:val="ͼ12"/>
+    <w:basedOn w:val="DefaultParagraphFont"/>
+    <w:rsid w:val="00CC7BE5"/>
+  </w:style>
 </w:styles>
 </file>
 

</xml_diff>